<commit_message>
detectar y eliminar combinaciones
</commit_message>
<xml_diff>
--- a/INFORME.docx
+++ b/INFORME.docx
@@ -13,6 +13,9 @@
         <w:br/>
       </w:r>
       <w:r>
+        <w:rPr>
+          <w:noProof/>
+        </w:rPr>
         <w:drawing>
           <wp:inline distT="0" distB="0" distL="0" distR="0" wp14:anchorId="4EC8474A" wp14:editId="196E1891">
             <wp:extent cx="5612130" cy="1965325"/>
@@ -58,7 +61,6 @@
           <w:numId w:val="2"/>
         </w:numPr>
       </w:pPr>
-      <w:proofErr w:type="spellStart"/>
       <w:r>
         <w:rPr>
           <w:b/>
@@ -66,7 +68,6 @@
         </w:rPr>
         <w:t>Desafio</w:t>
       </w:r>
-      <w:proofErr w:type="spellEnd"/>
       <w:r>
         <w:rPr>
           <w:b/>
@@ -80,7 +81,6 @@
       <w:r>
         <w:br/>
       </w:r>
-      <w:proofErr w:type="spellStart"/>
       <w:r>
         <w:rPr>
           <w:b/>
@@ -88,50 +88,62 @@
         </w:rPr>
         <w:t>Solucion</w:t>
       </w:r>
-      <w:proofErr w:type="spellEnd"/>
-      <w:r>
-        <w:t>:</w:t>
-      </w:r>
-      <w:r>
-        <w:t xml:space="preserve"> aplicar una </w:t>
-      </w:r>
-      <w:proofErr w:type="spellStart"/>
-      <w:r>
-        <w:t>mascara</w:t>
-      </w:r>
-      <w:proofErr w:type="spellEnd"/>
-      <w:r>
-        <w:t xml:space="preserve"> para quedarme solo con los bits que necesito</w:t>
-      </w:r>
-      <w:r>
-        <w:t>, como funciona? Una vez encontrada el bit donde está en ese byte la desplazo y aplico la mascara</w:t>
+      <w:r>
+        <w:t>: aplicar una mascara para quedarme solo con los bits que necesito, como funciona? Una vez encontrada el bit donde está en ese byte la desplazo y aplico la mascara</w:t>
       </w:r>
       <w:r>
         <w:br/>
       </w:r>
-      <w:proofErr w:type="spellStart"/>
       <w:r>
         <w:rPr>
           <w:b/>
           <w:bCs/>
         </w:rPr>
-        <w:t>Desadio</w:t>
-      </w:r>
-      <w:proofErr w:type="spellEnd"/>
+        <w:t xml:space="preserve">Desadio 1.2: </w:t>
+      </w:r>
+      <w:r>
+        <w:t>eso funciona bien para cuando la ficha está en un byte completa, pero si está separada no funciona</w:t>
+      </w:r>
+      <w:r>
+        <w:br/>
+      </w:r>
       <w:r>
         <w:rPr>
           <w:b/>
           <w:bCs/>
         </w:rPr>
-        <w:t xml:space="preserve"> 1.2: </w:t>
-      </w:r>
-      <w:r>
-        <w:t>eso funciona bien para cuando la ficha está en un byte completa, pero si está separada no funciona</w:t>
-      </w:r>
-      <w:r>
-        <w:br/>
-      </w:r>
-      <w:proofErr w:type="spellStart"/>
+        <w:t xml:space="preserve">Solucion: </w:t>
+      </w:r>
+      <w:r>
+        <w:t>Fue difícil, pero al final usando la misma mascara y el desplazamiento, me di cuenta que cuando estaba partido solo era en dos condiciones, por lo tanto la solución mas practica fue crear un if para esos dos casos especiales.</w:t>
+      </w:r>
+    </w:p>
+    <w:p>
+      <w:pPr>
+        <w:pStyle w:val="Prrafodelista"/>
+        <w:numPr>
+          <w:ilvl w:val="0"/>
+          <w:numId w:val="2"/>
+        </w:numPr>
+      </w:pPr>
+      <w:r>
+        <w:rPr>
+          <w:b/>
+          <w:bCs/>
+        </w:rPr>
+        <w:t>Desafio 2</w:t>
+      </w:r>
+      <w:r>
+        <w:t>:</w:t>
+      </w:r>
+      <w:r>
+        <w:t xml:space="preserve"> Para detectar y eliminar una combinación, si detectaba en fila pero también había en columna se me eliminaba una primero</w:t>
+      </w:r>
+    </w:p>
+    <w:p>
+      <w:pPr>
+        <w:pStyle w:val="Prrafodelista"/>
+      </w:pPr>
       <w:r>
         <w:rPr>
           <w:b/>
@@ -139,32 +151,11 @@
         </w:rPr>
         <w:t>Solucion</w:t>
       </w:r>
-      <w:proofErr w:type="spellEnd"/>
-      <w:r>
-        <w:rPr>
-          <w:b/>
-          <w:bCs/>
-        </w:rPr>
-        <w:t xml:space="preserve">: </w:t>
-      </w:r>
-      <w:r>
-        <w:t xml:space="preserve">Fue difícil, pero al final usando la misma mascara y el desplazamiento, me di cuenta que cuando estaba partido solo era en dos condiciones, por lo tanto la solución </w:t>
-      </w:r>
-      <w:proofErr w:type="spellStart"/>
-      <w:r>
-        <w:t>mas</w:t>
-      </w:r>
-      <w:proofErr w:type="spellEnd"/>
-      <w:r>
-        <w:t xml:space="preserve"> practica fue crear un </w:t>
-      </w:r>
-      <w:proofErr w:type="spellStart"/>
-      <w:r>
-        <w:t>if</w:t>
-      </w:r>
-      <w:proofErr w:type="spellEnd"/>
-      <w:r>
-        <w:t xml:space="preserve"> para esos dos casos especiales.</w:t>
+      <w:r>
+        <w:t>:</w:t>
+      </w:r>
+      <w:r>
+        <w:t xml:space="preserve"> Implementar una función que por medio de un arreglo del mismo tamaño del tablero, me guardara la ubicación de las fichas que pertenecían a una combinacion</w:t>
       </w:r>
       <w:r>
         <w:br/>

</xml_diff>

<commit_message>
Contar cascadas y fichas eliminadas - PD: tengo sueño
</commit_message>
<xml_diff>
--- a/INFORME.docx
+++ b/INFORME.docx
@@ -155,8 +155,159 @@
         <w:t>:</w:t>
       </w:r>
       <w:r>
-        <w:t xml:space="preserve"> Implementar una función que por medio de un arreglo del mismo tamaño del tablero, me guardara la ubicación de las fichas que pertenecían a una combinacion</w:t>
-      </w:r>
+        <w:t xml:space="preserve"> Implementar una función que por medio de un arreglo del mismo tamaño del tablero, me guardara la ubicación de las fichas que pertenecían a una </w:t>
+      </w:r>
+      <w:r>
+        <w:t>combinación, de tal manera que si había una cruz, guardaba las posiciones tanto en fila como en columna</w:t>
+      </w:r>
+      <w:r>
+        <w:t>.</w:t>
+      </w:r>
+    </w:p>
+    <w:p>
+      <w:pPr>
+        <w:pStyle w:val="Prrafodelista"/>
+        <w:numPr>
+          <w:ilvl w:val="0"/>
+          <w:numId w:val="2"/>
+        </w:numPr>
+      </w:pPr>
+      <w:r>
+        <w:rPr>
+          <w:b/>
+          <w:bCs/>
+        </w:rPr>
+        <w:t xml:space="preserve">Desadio 3: </w:t>
+      </w:r>
+      <w:r>
+        <w:t>Ahora, una vez que ya eliminaba las fichas que estaban marcadas, de repente me salían 6</w:t>
+      </w:r>
+      <w:r>
+        <w:t>(FICHA VACIA TEMPORALMENTE)</w:t>
+      </w:r>
+      <w:r>
+        <w:t xml:space="preserve"> en la salida </w:t>
+      </w:r>
+    </w:p>
+    <w:p>
+      <w:pPr>
+        <w:pStyle w:val="Prrafodelista"/>
+      </w:pPr>
+      <w:r>
+        <w:rPr>
+          <w:b/>
+          <w:bCs/>
+        </w:rPr>
+        <w:t>Solucion:</w:t>
+      </w:r>
+      <w:r>
+        <w:t xml:space="preserve"> </w:t>
+      </w:r>
+      <w:r>
+        <w:t xml:space="preserve">meti la función aplicar gravedad en columna dentro de un ciclo, para que se me hiciera repetidas veces y ya no saliera ningún 6 </w:t>
+      </w:r>
+    </w:p>
+    <w:p>
+      <w:pPr>
+        <w:pStyle w:val="Prrafodelista"/>
+      </w:pPr>
+    </w:p>
+    <w:p>
+      <w:pPr>
+        <w:pStyle w:val="Prrafodelista"/>
+        <w:numPr>
+          <w:ilvl w:val="0"/>
+          <w:numId w:val="2"/>
+        </w:numPr>
+      </w:pPr>
+      <w:r>
+        <w:rPr>
+          <w:b/>
+          <w:bCs/>
+        </w:rPr>
+        <w:t xml:space="preserve">Desafio 4: </w:t>
+      </w:r>
+      <w:r>
+        <w:t>Hay que tener en cuenta las fichas eliminadas y las cascadas ejecutadas</w:t>
+      </w:r>
+    </w:p>
+    <w:p>
+      <w:pPr>
+        <w:pStyle w:val="Prrafodelista"/>
+      </w:pPr>
+      <w:r>
+        <w:rPr>
+          <w:b/>
+          <w:bCs/>
+        </w:rPr>
+        <w:t>Solucion:</w:t>
+      </w:r>
+      <w:r>
+        <w:t xml:space="preserve"> la función Procesar combinaciones me cuenta las cascadas y las fichas, ahora tenia que sacarlas…. Intenté usar puntero, pero me tocaba </w:t>
+      </w:r>
+      <w:r>
+        <w:lastRenderedPageBreak/>
+        <w:t>modificar bastantes cosas, al final, investigando y probando un poco, decidí usar parámetros por referencia para acceder directamente a la variable dentro de la función y poder llamarla en el main.</w:t>
+      </w:r>
+      <w:r>
+        <w:br/>
+      </w:r>
+    </w:p>
+    <w:p>
+      <w:pPr>
+        <w:pStyle w:val="Prrafodelista"/>
+        <w:numPr>
+          <w:ilvl w:val="0"/>
+          <w:numId w:val="2"/>
+        </w:numPr>
+      </w:pPr>
+      <w:r>
+        <w:rPr>
+          <w:b/>
+          <w:bCs/>
+        </w:rPr>
+        <w:t xml:space="preserve">Desafio </w:t>
+      </w:r>
+      <w:r>
+        <w:rPr>
+          <w:b/>
+          <w:bCs/>
+        </w:rPr>
+        <w:t>5</w:t>
+      </w:r>
+      <w:r>
+        <w:rPr>
+          <w:b/>
+          <w:bCs/>
+        </w:rPr>
+        <w:t xml:space="preserve">: </w:t>
+      </w:r>
+      <w:r>
+        <w:t>Ya está funcionando hasta las cascadas de combinaciones, el tema ahora es poder eliminar o añadir columnas y filas sin afectar la secuencia seguida de bits.</w:t>
+      </w:r>
+    </w:p>
+    <w:p>
+      <w:pPr>
+        <w:pStyle w:val="Prrafodelista"/>
+        <w:rPr>
+          <w:lang w:val="es-MX"/>
+        </w:rPr>
+      </w:pPr>
+      <w:r>
+        <w:rPr>
+          <w:b/>
+          <w:bCs/>
+        </w:rPr>
+        <w:t>Solucion:</w:t>
+      </w:r>
+      <w:r>
+        <w:t xml:space="preserve"> </w:t>
+      </w:r>
+    </w:p>
+    <w:p>
+      <w:pPr>
+        <w:pStyle w:val="Prrafodelista"/>
+      </w:pPr>
       <w:r>
         <w:br/>
       </w:r>
@@ -176,7 +327,7 @@
   <w:abstractNum w:abstractNumId="0" w15:restartNumberingAfterBreak="0">
     <w:nsid w:val="1281156F"/>
     <w:multiLevelType w:val="hybridMultilevel"/>
-    <w:tmpl w:val="ED06BCAA"/>
+    <w:tmpl w:val="1068A1F8"/>
     <w:lvl w:ilvl="0" w:tplc="240A0001">
       <w:start w:val="1"/>
       <w:numFmt w:val="bullet"/>

</xml_diff>